<commit_message>
Technisches Konzept bis zum Wizard
</commit_message>
<xml_diff>
--- a/Dokumentation/Projektdokumentation/Projektdokumentation Yannick Spangel.docx
+++ b/Dokumentation/Projektdokumentation/Projektdokumentation Yannick Spangel.docx
@@ -73,8 +73,8 @@
               <w:rPr/>
             </w:pPr>
             <w:bookmarkStart w:id="0" w:name="_Toc412032348"/>
-            <w:bookmarkStart w:id="1" w:name="_Toc411933128"/>
-            <w:bookmarkStart w:id="2" w:name="_Toc411931188"/>
+            <w:bookmarkStart w:id="1" w:name="_Toc411931188"/>
+            <w:bookmarkStart w:id="2" w:name="_Toc411933128"/>
             <w:r>
               <w:rPr>
                 <w:rFonts w:cs="Alexandria" w:ascii="Alexandria" w:hAnsi="Alexandria"/>
@@ -371,7 +371,7 @@
                         <w:txbxContent>
                           <w:p>
                             <w:pPr>
-                              <w:pStyle w:val="FrameContentsuser"/>
+                              <w:pStyle w:val="FrameContents"/>
                               <w:spacing w:before="60" w:after="0"/>
                               <w:rPr>
                                 <w:rFonts w:cs="Alexandria Light"/>
@@ -393,7 +393,7 @@
                           </w:p>
                           <w:p>
                             <w:pPr>
-                              <w:pStyle w:val="FrameContentsuser"/>
+                              <w:pStyle w:val="FrameContents"/>
                               <w:rPr>
                                 <w:rStyle w:val="Hyperlink"/>
                                 <w:bCs/>
@@ -448,7 +448,7 @@
                           </w:p>
                           <w:p>
                             <w:pPr>
-                              <w:pStyle w:val="FrameContentsuser"/>
+                              <w:pStyle w:val="FrameContents"/>
                               <w:rPr>
                                 <w:rStyle w:val="Hyperlink"/>
                                 <w:bCs/>
@@ -471,7 +471,7 @@
                           </w:p>
                           <w:p>
                             <w:pPr>
-                              <w:pStyle w:val="FrameContentsuser"/>
+                              <w:pStyle w:val="FrameContents"/>
                               <w:rPr>
                                 <w:rStyle w:val="Hyperlink"/>
                                 <w:bCs/>
@@ -494,7 +494,7 @@
                           </w:p>
                           <w:p>
                             <w:pPr>
-                              <w:pStyle w:val="FrameContentsuser"/>
+                              <w:pStyle w:val="FrameContents"/>
                               <w:rPr>
                                 <w:rStyle w:val="Hyperlink"/>
                                 <w:bCs/>
@@ -517,7 +517,7 @@
                           </w:p>
                           <w:p>
                             <w:pPr>
-                              <w:pStyle w:val="FrameContentsuser"/>
+                              <w:pStyle w:val="FrameContents"/>
                               <w:rPr>
                                 <w:rStyle w:val="Hyperlink"/>
                                 <w:bCs/>
@@ -556,7 +556,7 @@
                   <w:txbxContent>
                     <w:p>
                       <w:pPr>
-                        <w:pStyle w:val="FrameContentsuser"/>
+                        <w:pStyle w:val="FrameContents"/>
                         <w:spacing w:before="60" w:after="0"/>
                         <w:rPr>
                           <w:rFonts w:cs="Alexandria Light"/>
@@ -578,7 +578,7 @@
                     </w:p>
                     <w:p>
                       <w:pPr>
-                        <w:pStyle w:val="FrameContentsuser"/>
+                        <w:pStyle w:val="FrameContents"/>
                         <w:rPr>
                           <w:rStyle w:val="Hyperlink"/>
                           <w:bCs/>
@@ -633,7 +633,7 @@
                     </w:p>
                     <w:p>
                       <w:pPr>
-                        <w:pStyle w:val="FrameContentsuser"/>
+                        <w:pStyle w:val="FrameContents"/>
                         <w:rPr>
                           <w:rStyle w:val="Hyperlink"/>
                           <w:bCs/>
@@ -656,7 +656,7 @@
                     </w:p>
                     <w:p>
                       <w:pPr>
-                        <w:pStyle w:val="FrameContentsuser"/>
+                        <w:pStyle w:val="FrameContents"/>
                         <w:rPr>
                           <w:rStyle w:val="Hyperlink"/>
                           <w:bCs/>
@@ -679,7 +679,7 @@
                     </w:p>
                     <w:p>
                       <w:pPr>
-                        <w:pStyle w:val="FrameContentsuser"/>
+                        <w:pStyle w:val="FrameContents"/>
                         <w:rPr>
                           <w:rStyle w:val="Hyperlink"/>
                           <w:bCs/>
@@ -702,7 +702,7 @@
                     </w:p>
                     <w:p>
                       <w:pPr>
-                        <w:pStyle w:val="FrameContentsuser"/>
+                        <w:pStyle w:val="FrameContents"/>
                         <w:rPr>
                           <w:rStyle w:val="Hyperlink"/>
                           <w:bCs/>
@@ -775,7 +775,7 @@
                         <w:txbxContent>
                           <w:p>
                             <w:pPr>
-                              <w:pStyle w:val="FrameContentsuser"/>
+                              <w:pStyle w:val="FrameContents"/>
                               <w:spacing w:before="60" w:after="60"/>
                               <w:rPr>
                                 <w:b/>
@@ -795,7 +795,7 @@
                           </w:p>
                           <w:p>
                             <w:pPr>
-                              <w:pStyle w:val="FrameContentsuser"/>
+                              <w:pStyle w:val="FrameContents"/>
                               <w:rPr>
                                 <w:sz w:val="16"/>
                                 <w:szCs w:val="16"/>
@@ -812,7 +812,7 @@
                           </w:p>
                           <w:p>
                             <w:pPr>
-                              <w:pStyle w:val="FrameContentsuser"/>
+                              <w:pStyle w:val="FrameContents"/>
                               <w:rPr>
                                 <w:sz w:val="16"/>
                                 <w:szCs w:val="16"/>
@@ -829,7 +829,7 @@
                           </w:p>
                           <w:p>
                             <w:pPr>
-                              <w:pStyle w:val="FrameContentsuser"/>
+                              <w:pStyle w:val="FrameContents"/>
                               <w:rPr>
                                 <w:sz w:val="16"/>
                                 <w:szCs w:val="16"/>
@@ -846,7 +846,7 @@
                           </w:p>
                           <w:p>
                             <w:pPr>
-                              <w:pStyle w:val="FrameContentsuser"/>
+                              <w:pStyle w:val="FrameContents"/>
                               <w:spacing w:before="60" w:after="60"/>
                               <w:rPr>
                                 <w:b/>
@@ -866,7 +866,7 @@
                           </w:p>
                           <w:p>
                             <w:pPr>
-                              <w:pStyle w:val="FrameContentsuser"/>
+                              <w:pStyle w:val="FrameContents"/>
                               <w:rPr>
                                 <w:sz w:val="16"/>
                                 <w:szCs w:val="16"/>
@@ -884,7 +884,7 @@
                           </w:p>
                           <w:p>
                             <w:pPr>
-                              <w:pStyle w:val="FrameContentsuser"/>
+                              <w:pStyle w:val="FrameContents"/>
                               <w:rPr>
                                 <w:b/>
                                 <w:sz w:val="18"/>
@@ -903,7 +903,7 @@
                           </w:p>
                           <w:p>
                             <w:pPr>
-                              <w:pStyle w:val="FrameContentsuser"/>
+                              <w:pStyle w:val="FrameContents"/>
                               <w:rPr>
                                 <w:sz w:val="16"/>
                                 <w:szCs w:val="16"/>
@@ -920,7 +920,7 @@
                           </w:p>
                           <w:p>
                             <w:pPr>
-                              <w:pStyle w:val="FrameContentsuser"/>
+                              <w:pStyle w:val="FrameContents"/>
                               <w:rPr>
                                 <w:sz w:val="16"/>
                                 <w:szCs w:val="16"/>
@@ -955,7 +955,7 @@
                   <w:txbxContent>
                     <w:p>
                       <w:pPr>
-                        <w:pStyle w:val="FrameContentsuser"/>
+                        <w:pStyle w:val="FrameContents"/>
                         <w:spacing w:before="60" w:after="60"/>
                         <w:rPr>
                           <w:b/>
@@ -975,7 +975,7 @@
                     </w:p>
                     <w:p>
                       <w:pPr>
-                        <w:pStyle w:val="FrameContentsuser"/>
+                        <w:pStyle w:val="FrameContents"/>
                         <w:rPr>
                           <w:sz w:val="16"/>
                           <w:szCs w:val="16"/>
@@ -992,7 +992,7 @@
                     </w:p>
                     <w:p>
                       <w:pPr>
-                        <w:pStyle w:val="FrameContentsuser"/>
+                        <w:pStyle w:val="FrameContents"/>
                         <w:rPr>
                           <w:sz w:val="16"/>
                           <w:szCs w:val="16"/>
@@ -1009,7 +1009,7 @@
                     </w:p>
                     <w:p>
                       <w:pPr>
-                        <w:pStyle w:val="FrameContentsuser"/>
+                        <w:pStyle w:val="FrameContents"/>
                         <w:rPr>
                           <w:sz w:val="16"/>
                           <w:szCs w:val="16"/>
@@ -1026,7 +1026,7 @@
                     </w:p>
                     <w:p>
                       <w:pPr>
-                        <w:pStyle w:val="FrameContentsuser"/>
+                        <w:pStyle w:val="FrameContents"/>
                         <w:spacing w:before="60" w:after="60"/>
                         <w:rPr>
                           <w:b/>
@@ -1046,7 +1046,7 @@
                     </w:p>
                     <w:p>
                       <w:pPr>
-                        <w:pStyle w:val="FrameContentsuser"/>
+                        <w:pStyle w:val="FrameContents"/>
                         <w:rPr>
                           <w:sz w:val="16"/>
                           <w:szCs w:val="16"/>
@@ -1064,7 +1064,7 @@
                     </w:p>
                     <w:p>
                       <w:pPr>
-                        <w:pStyle w:val="FrameContentsuser"/>
+                        <w:pStyle w:val="FrameContents"/>
                         <w:rPr>
                           <w:b/>
                           <w:sz w:val="18"/>
@@ -1083,7 +1083,7 @@
                     </w:p>
                     <w:p>
                       <w:pPr>
-                        <w:pStyle w:val="FrameContentsuser"/>
+                        <w:pStyle w:val="FrameContents"/>
                         <w:rPr>
                           <w:sz w:val="16"/>
                           <w:szCs w:val="16"/>
@@ -1100,7 +1100,7 @@
                     </w:p>
                     <w:p>
                       <w:pPr>
-                        <w:pStyle w:val="FrameContentsuser"/>
+                        <w:pStyle w:val="FrameContents"/>
                         <w:rPr>
                           <w:sz w:val="16"/>
                           <w:szCs w:val="16"/>
@@ -3526,9 +3526,9 @@
         </w:numPr>
         <w:rPr/>
       </w:pPr>
-      <w:bookmarkStart w:id="3" w:name="_Toc181697548"/>
+      <w:bookmarkStart w:id="3" w:name="_Toc218703493"/>
       <w:bookmarkStart w:id="4" w:name="_Toc181708996"/>
-      <w:bookmarkStart w:id="5" w:name="_Toc218703493"/>
+      <w:bookmarkStart w:id="5" w:name="_Toc181697548"/>
       <w:r>
         <w:rPr/>
         <w:t>Einleitung</w:t>
@@ -3586,8 +3586,8 @@
         <w:rPr/>
       </w:pPr>
       <w:bookmarkStart w:id="6" w:name="_Toc181697549"/>
-      <w:bookmarkStart w:id="7" w:name="_Toc218703494"/>
-      <w:bookmarkStart w:id="8" w:name="_Toc181708997"/>
+      <w:bookmarkStart w:id="7" w:name="_Toc181708997"/>
+      <w:bookmarkStart w:id="8" w:name="_Toc218703494"/>
       <w:r>
         <w:rPr/>
         <w:t>Projekteinführung</w:t>
@@ -3605,9 +3605,9 @@
         </w:numPr>
         <w:rPr/>
       </w:pPr>
-      <w:bookmarkStart w:id="9" w:name="_Toc181708998"/>
-      <w:bookmarkStart w:id="10" w:name="_Toc181697550"/>
-      <w:bookmarkStart w:id="11" w:name="_Toc218703495"/>
+      <w:bookmarkStart w:id="9" w:name="_Toc181697550"/>
+      <w:bookmarkStart w:id="10" w:name="_Toc218703495"/>
+      <w:bookmarkStart w:id="11" w:name="_Toc181708998"/>
       <w:r>
         <w:rPr/>
         <w:t>Ist-Zustand</w:t>
@@ -3656,11 +3656,11 @@
         </w:numPr>
         <w:rPr/>
       </w:pPr>
-      <w:bookmarkStart w:id="12" w:name="_Toc181708999"/>
+      <w:bookmarkStart w:id="12" w:name="_Toc218703496"/>
       <w:bookmarkStart w:id="13" w:name="_Toc181697551"/>
-      <w:bookmarkStart w:id="14" w:name="_Toc218703496"/>
-      <w:bookmarkStart w:id="15" w:name="_Toc182313709"/>
-      <w:bookmarkStart w:id="16" w:name="_Toc182399888"/>
+      <w:bookmarkStart w:id="14" w:name="_Toc181708999"/>
+      <w:bookmarkStart w:id="15" w:name="_Toc182399888"/>
+      <w:bookmarkStart w:id="16" w:name="_Toc182313709"/>
       <w:bookmarkEnd w:id="15"/>
       <w:bookmarkEnd w:id="16"/>
       <w:r>
@@ -3870,8 +3870,8 @@
         <w:rPr/>
       </w:pPr>
       <w:bookmarkStart w:id="17" w:name="_Toc181697552"/>
-      <w:bookmarkStart w:id="18" w:name="_Toc181709000"/>
-      <w:bookmarkStart w:id="19" w:name="_Toc218703497"/>
+      <w:bookmarkStart w:id="18" w:name="_Toc218703497"/>
+      <w:bookmarkStart w:id="19" w:name="_Toc181709000"/>
       <w:r>
         <w:rPr/>
         <w:t>Projektumfeld</w:t>
@@ -3985,9 +3985,9 @@
         </w:numPr>
         <w:rPr/>
       </w:pPr>
-      <w:bookmarkStart w:id="20" w:name="_Toc218703498"/>
-      <w:bookmarkStart w:id="21" w:name="_Toc181697553"/>
-      <w:bookmarkStart w:id="22" w:name="_Toc181709001"/>
+      <w:bookmarkStart w:id="20" w:name="_Toc181697553"/>
+      <w:bookmarkStart w:id="21" w:name="_Toc181709001"/>
+      <w:bookmarkStart w:id="22" w:name="_Toc218703498"/>
       <w:r>
         <w:rPr/>
         <w:t>Projektabgrenzung</w:t>
@@ -4064,9 +4064,9 @@
         </w:numPr>
         <w:rPr/>
       </w:pPr>
-      <w:bookmarkStart w:id="23" w:name="_Toc181697554"/>
+      <w:bookmarkStart w:id="23" w:name="_Toc218703499"/>
       <w:bookmarkStart w:id="24" w:name="_Toc181709002"/>
-      <w:bookmarkStart w:id="25" w:name="_Toc218703499"/>
+      <w:bookmarkStart w:id="25" w:name="_Toc181697554"/>
       <w:r>
         <w:rPr/>
         <w:t>Projektvorgehen</w:t>
@@ -4084,9 +4084,9 @@
         </w:numPr>
         <w:rPr/>
       </w:pPr>
-      <w:bookmarkStart w:id="26" w:name="_Toc181709003"/>
+      <w:bookmarkStart w:id="26" w:name="_Toc181697555"/>
       <w:bookmarkStart w:id="27" w:name="_Toc218703500"/>
-      <w:bookmarkStart w:id="28" w:name="_Toc181697555"/>
+      <w:bookmarkStart w:id="28" w:name="_Toc181709003"/>
       <w:bookmarkStart w:id="29" w:name="_Vorgehensweise"/>
       <w:bookmarkEnd w:id="29"/>
       <w:r>
@@ -4264,9 +4264,9 @@
         <w:bidi w:val="0"/>
         <w:rPr/>
       </w:pPr>
-      <w:bookmarkStart w:id="33" w:name="_Toc181709005"/>
+      <w:bookmarkStart w:id="33" w:name="_Toc218703502"/>
       <w:bookmarkStart w:id="34" w:name="_Toc181697557"/>
-      <w:bookmarkStart w:id="35" w:name="_Toc218703502"/>
+      <w:bookmarkStart w:id="35" w:name="_Toc181709005"/>
       <w:r>
         <w:rPr/>
         <w:t>Personelle Ressourcen</w:t>
@@ -4285,28 +4285,9 @@
       </w:pPr>
       <w:r>
         <w:rPr>
-          <w:color w:val="FF4000"/>
-        </w:rPr>
-        <w:t xml:space="preserve">─── </w:t>
-      </w:r>
-      <w:r>
-        <w:rPr>
-          <w:color w:val="FF4000"/>
-        </w:rPr>
-        <w:t>TODO: Stundensätze erfragen und mit wieviel Stunden gerechnet werden soll für Nadines und Rafaels Aufwand ───</w:t>
-      </w:r>
-    </w:p>
-    <w:p>
-      <w:pPr>
-        <w:pStyle w:val="Normal"/>
-        <w:bidi w:val="0"/>
-        <w:rPr/>
-      </w:pPr>
-      <w:r>
-        <w:rPr>
           <w:color w:val="0070C0"/>
         </w:rPr>
-        <w:t>Wer wirkt mit wie vielen Stunden zu welchem Stundensatz an eurem Projekt mit?</w:t>
+        <w:t>Eine Detaillierte Übersicht der Personalkosten</w:t>
       </w:r>
     </w:p>
     <w:p>
@@ -4319,9 +4300,9 @@
         <w:bidi w:val="0"/>
         <w:rPr/>
       </w:pPr>
-      <w:bookmarkStart w:id="36" w:name="_Toc181697558"/>
+      <w:bookmarkStart w:id="36" w:name="_Toc218703503"/>
       <w:bookmarkStart w:id="37" w:name="_Toc181709006"/>
-      <w:bookmarkStart w:id="38" w:name="_Toc218703503"/>
+      <w:bookmarkStart w:id="38" w:name="_Toc181697558"/>
       <w:r>
         <w:rPr/>
         <w:t>Non-Personelle Ressourcen</w:t>
@@ -4624,6 +4605,16 @@
     </w:p>
     <w:p>
       <w:pPr>
+        <w:pStyle w:val="Normal"/>
+        <w:bidi w:val="0"/>
+        <w:rPr/>
+      </w:pPr>
+      <w:r>
+        <w:rPr/>
+      </w:r>
+    </w:p>
+    <w:p>
+      <w:pPr>
         <w:pStyle w:val="Heading2"/>
         <w:numPr>
           <w:ilvl w:val="1"/>
@@ -4631,8 +4622,8 @@
         </w:numPr>
         <w:rPr/>
       </w:pPr>
-      <w:bookmarkStart w:id="39" w:name="_Toc181709008"/>
-      <w:bookmarkStart w:id="40" w:name="_Toc181697560"/>
+      <w:bookmarkStart w:id="39" w:name="_Toc181697560"/>
+      <w:bookmarkStart w:id="40" w:name="_Toc181709008"/>
       <w:bookmarkStart w:id="41" w:name="_Toc218703504"/>
       <w:r>
         <w:rPr/>
@@ -5995,17 +5986,7 @@
                 <w:szCs w:val="20"/>
                 <w:lang w:val="de-DE" w:eastAsia="ja-JP" w:bidi="ar-SA"/>
               </w:rPr>
-              <w:t>4</w:t>
-            </w:r>
-            <w:r>
-              <w:rPr>
-                <w:rFonts w:eastAsia="Times New Roman" w:cs="Times New Roman"/>
-                <w:kern w:val="0"/>
-                <w:sz w:val="20"/>
-                <w:szCs w:val="20"/>
-                <w:lang w:val="de-DE" w:eastAsia="ja-JP" w:bidi="ar-SA"/>
-              </w:rPr>
-              <w:t>h</w:t>
+              <w:t>4h</w:t>
             </w:r>
           </w:p>
         </w:tc>
@@ -6102,31 +6083,7 @@
                 <w:szCs w:val="20"/>
                 <w:lang w:val="de-DE" w:eastAsia="ja-JP" w:bidi="ar-SA"/>
               </w:rPr>
-              <w:t>3</w:t>
-            </w:r>
-            <w:r>
-              <w:rPr>
-                <w:rFonts w:eastAsia="Times New Roman" w:cs="Times New Roman"/>
-                <w:b/>
-                <w:bCs/>
-                <w:kern w:val="0"/>
-                <w:sz w:val="20"/>
-                <w:szCs w:val="20"/>
-                <w:lang w:val="de-DE" w:eastAsia="ja-JP" w:bidi="ar-SA"/>
-              </w:rPr>
-              <w:t>1</w:t>
-            </w:r>
-            <w:r>
-              <w:rPr>
-                <w:rFonts w:eastAsia="Times New Roman" w:cs="Times New Roman"/>
-                <w:b/>
-                <w:bCs/>
-                <w:kern w:val="0"/>
-                <w:sz w:val="20"/>
-                <w:szCs w:val="20"/>
-                <w:lang w:val="de-DE" w:eastAsia="ja-JP" w:bidi="ar-SA"/>
-              </w:rPr>
-              <w:t>h</w:t>
+              <w:t>31h</w:t>
             </w:r>
           </w:p>
         </w:tc>
@@ -6864,17 +6821,7 @@
                 <w:szCs w:val="20"/>
                 <w:lang w:val="de-DE" w:eastAsia="ja-JP" w:bidi="ar-SA"/>
               </w:rPr>
-              <w:t>2</w:t>
-            </w:r>
-            <w:r>
-              <w:rPr>
-                <w:rFonts w:eastAsia="Times New Roman" w:cs="Times New Roman"/>
-                <w:kern w:val="0"/>
-                <w:sz w:val="20"/>
-                <w:szCs w:val="20"/>
-                <w:lang w:val="de-DE" w:eastAsia="ja-JP" w:bidi="ar-SA"/>
-              </w:rPr>
-              <w:t>h</w:t>
+              <w:t>2h</w:t>
             </w:r>
           </w:p>
         </w:tc>
@@ -7060,17 +7007,7 @@
                 <w:szCs w:val="20"/>
                 <w:lang w:val="de-DE" w:eastAsia="ja-JP" w:bidi="ar-SA"/>
               </w:rPr>
-              <w:t>8</w:t>
-            </w:r>
-            <w:r>
-              <w:rPr>
-                <w:rFonts w:eastAsia="Times New Roman" w:cs="Times New Roman"/>
-                <w:kern w:val="0"/>
-                <w:sz w:val="20"/>
-                <w:szCs w:val="20"/>
-                <w:lang w:val="de-DE" w:eastAsia="ja-JP" w:bidi="ar-SA"/>
-              </w:rPr>
-              <w:t>h</w:t>
+              <w:t>8h</w:t>
             </w:r>
           </w:p>
         </w:tc>
@@ -7260,31 +7197,7 @@
                 <w:szCs w:val="20"/>
                 <w:lang w:val="de-DE" w:eastAsia="ja-JP" w:bidi="ar-SA"/>
               </w:rPr>
-              <w:t>1</w:t>
-            </w:r>
-            <w:r>
-              <w:rPr>
-                <w:rFonts w:eastAsia="Times New Roman" w:cs="Times New Roman"/>
-                <w:b/>
-                <w:bCs/>
-                <w:kern w:val="0"/>
-                <w:sz w:val="20"/>
-                <w:szCs w:val="20"/>
-                <w:lang w:val="de-DE" w:eastAsia="ja-JP" w:bidi="ar-SA"/>
-              </w:rPr>
-              <w:t>3</w:t>
-            </w:r>
-            <w:r>
-              <w:rPr>
-                <w:rFonts w:eastAsia="Times New Roman" w:cs="Times New Roman"/>
-                <w:b/>
-                <w:bCs/>
-                <w:kern w:val="0"/>
-                <w:sz w:val="20"/>
-                <w:szCs w:val="20"/>
-                <w:lang w:val="de-DE" w:eastAsia="ja-JP" w:bidi="ar-SA"/>
-              </w:rPr>
-              <w:t>h</w:t>
+              <w:t>13h</w:t>
             </w:r>
           </w:p>
         </w:tc>
@@ -7484,13 +7397,52 @@
         <w:rPr>
           <w:color w:val="FF0000"/>
         </w:rPr>
-        <w:t xml:space="preserve">─── </w:t>
-      </w:r>
-      <w:r>
-        <w:rPr>
-          <w:color w:val="FF0000"/>
-        </w:rPr>
-        <w:t>TODO: Stundensätzen erfragen ───</w:t>
+        <w:drawing>
+          <wp:anchor distT="0" distB="0" distL="0" distR="0" simplePos="0" relativeHeight="9" behindDoc="0" locked="0" layoutInCell="0" allowOverlap="1">
+            <wp:simplePos x="0" y="0"/>
+            <wp:positionH relativeFrom="column">
+              <wp:align>left</wp:align>
+            </wp:positionH>
+            <wp:positionV relativeFrom="paragraph">
+              <wp:posOffset>635</wp:posOffset>
+            </wp:positionV>
+            <wp:extent cx="3649980" cy="786765"/>
+            <wp:effectExtent l="0" t="0" r="0" b="0"/>
+            <wp:wrapTopAndBottom/>
+            <wp:docPr id="6" name="Image1"/>
+            <wp:cNvGraphicFramePr>
+              <a:graphicFrameLocks xmlns:a="http://schemas.openxmlformats.org/drawingml/2006/main" noChangeAspect="1"/>
+            </wp:cNvGraphicFramePr>
+            <a:graphic xmlns:a="http://schemas.openxmlformats.org/drawingml/2006/main">
+              <a:graphicData uri="http://schemas.openxmlformats.org/drawingml/2006/picture">
+                <pic:pic xmlns:pic="http://schemas.openxmlformats.org/drawingml/2006/picture">
+                  <pic:nvPicPr>
+                    <pic:cNvPr id="6" name="Image1"/>
+                    <pic:cNvPicPr>
+                      <a:picLocks noChangeAspect="1" noChangeArrowheads="1"/>
+                    </pic:cNvPicPr>
+                  </pic:nvPicPr>
+                  <pic:blipFill>
+                    <a:blip r:embed="rId16"/>
+                    <a:stretch>
+                      <a:fillRect/>
+                    </a:stretch>
+                  </pic:blipFill>
+                  <pic:spPr bwMode="auto">
+                    <a:xfrm>
+                      <a:off x="0" y="0"/>
+                      <a:ext cx="3649980" cy="786765"/>
+                    </a:xfrm>
+                    <a:prstGeom prst="rect">
+                      <a:avLst/>
+                    </a:prstGeom>
+                    <a:noFill/>
+                  </pic:spPr>
+                </pic:pic>
+              </a:graphicData>
+            </a:graphic>
+          </wp:anchor>
+        </w:drawing>
       </w:r>
     </w:p>
     <w:p>
@@ -7504,28 +7456,62 @@
       </w:pPr>
       <w:r>
         <w:rPr/>
-        <w:t>Amortisationsrechnung</w:t>
+        <w:t>Jährliche Einsparung</w:t>
       </w:r>
     </w:p>
     <w:p>
       <w:pPr>
         <w:pStyle w:val="Normal"/>
-        <w:spacing w:before="0" w:after="0"/>
-        <w:rPr>
-          <w:color w:val="FF0000"/>
-        </w:rPr>
-      </w:pPr>
-      <w:r>
-        <w:rPr>
-          <w:color w:val="FF0000"/>
-        </w:rPr>
-        <w:t xml:space="preserve">─── </w:t>
-      </w:r>
-      <w:r>
-        <w:rPr>
-          <w:color w:val="FF0000"/>
-        </w:rPr>
-        <w:t>TODO: Häufigkeit der Anträge + Durchschnittliche Bearbeitungsdauer  ───</w:t>
+        <w:rPr/>
+      </w:pPr>
+      <w:r>
+        <w:rPr/>
+        <w:drawing>
+          <wp:anchor distT="0" distB="0" distL="0" distR="0" simplePos="0" relativeHeight="10" behindDoc="0" locked="0" layoutInCell="0" allowOverlap="1">
+            <wp:simplePos x="0" y="0"/>
+            <wp:positionH relativeFrom="column">
+              <wp:align>left</wp:align>
+            </wp:positionH>
+            <wp:positionV relativeFrom="paragraph">
+              <wp:posOffset>635</wp:posOffset>
+            </wp:positionV>
+            <wp:extent cx="3649980" cy="1160780"/>
+            <wp:effectExtent l="0" t="0" r="0" b="0"/>
+            <wp:wrapTopAndBottom/>
+            <wp:docPr id="7" name="Image2"/>
+            <wp:cNvGraphicFramePr>
+              <a:graphicFrameLocks xmlns:a="http://schemas.openxmlformats.org/drawingml/2006/main" noChangeAspect="1"/>
+            </wp:cNvGraphicFramePr>
+            <a:graphic xmlns:a="http://schemas.openxmlformats.org/drawingml/2006/main">
+              <a:graphicData uri="http://schemas.openxmlformats.org/drawingml/2006/picture">
+                <pic:pic xmlns:pic="http://schemas.openxmlformats.org/drawingml/2006/picture">
+                  <pic:nvPicPr>
+                    <pic:cNvPr id="7" name="Image2"/>
+                    <pic:cNvPicPr>
+                      <a:picLocks noChangeAspect="1" noChangeArrowheads="1"/>
+                    </pic:cNvPicPr>
+                  </pic:nvPicPr>
+                  <pic:blipFill>
+                    <a:blip r:embed="rId17"/>
+                    <a:stretch>
+                      <a:fillRect/>
+                    </a:stretch>
+                  </pic:blipFill>
+                  <pic:spPr bwMode="auto">
+                    <a:xfrm>
+                      <a:off x="0" y="0"/>
+                      <a:ext cx="3649980" cy="1160780"/>
+                    </a:xfrm>
+                    <a:prstGeom prst="rect">
+                      <a:avLst/>
+                    </a:prstGeom>
+                    <a:noFill/>
+                  </pic:spPr>
+                </pic:pic>
+              </a:graphicData>
+            </a:graphic>
+          </wp:anchor>
+        </w:drawing>
       </w:r>
     </w:p>
     <w:p>
@@ -7539,6 +7525,94 @@
       </w:pPr>
       <w:r>
         <w:rPr/>
+        <w:t>Amortisationsrechnung</w:t>
+      </w:r>
+    </w:p>
+    <w:p>
+      <w:pPr>
+        <w:pStyle w:val="Normal"/>
+        <w:spacing w:before="0" w:after="0"/>
+        <w:rPr>
+          <w:color w:val="FF0000"/>
+        </w:rPr>
+      </w:pPr>
+      <w:r>
+        <w:rPr>
+          <w:color w:val="FF0000"/>
+        </w:rPr>
+        <w:drawing>
+          <wp:anchor distT="0" distB="0" distL="0" distR="0" simplePos="0" relativeHeight="11" behindDoc="0" locked="0" layoutInCell="0" allowOverlap="1">
+            <wp:simplePos x="0" y="0"/>
+            <wp:positionH relativeFrom="column">
+              <wp:align>left</wp:align>
+            </wp:positionH>
+            <wp:positionV relativeFrom="paragraph">
+              <wp:posOffset>635</wp:posOffset>
+            </wp:positionV>
+            <wp:extent cx="3637915" cy="1502410"/>
+            <wp:effectExtent l="0" t="0" r="0" b="0"/>
+            <wp:wrapTopAndBottom/>
+            <wp:docPr id="8" name="Image3"/>
+            <wp:cNvGraphicFramePr>
+              <a:graphicFrameLocks xmlns:a="http://schemas.openxmlformats.org/drawingml/2006/main" noChangeAspect="1"/>
+            </wp:cNvGraphicFramePr>
+            <a:graphic xmlns:a="http://schemas.openxmlformats.org/drawingml/2006/main">
+              <a:graphicData uri="http://schemas.openxmlformats.org/drawingml/2006/picture">
+                <pic:pic xmlns:pic="http://schemas.openxmlformats.org/drawingml/2006/picture">
+                  <pic:nvPicPr>
+                    <pic:cNvPr id="8" name="Image3"/>
+                    <pic:cNvPicPr>
+                      <a:picLocks noChangeAspect="1" noChangeArrowheads="1"/>
+                    </pic:cNvPicPr>
+                  </pic:nvPicPr>
+                  <pic:blipFill>
+                    <a:blip r:embed="rId18"/>
+                    <a:stretch>
+                      <a:fillRect/>
+                    </a:stretch>
+                  </pic:blipFill>
+                  <pic:spPr bwMode="auto">
+                    <a:xfrm>
+                      <a:off x="0" y="0"/>
+                      <a:ext cx="3637915" cy="1502410"/>
+                    </a:xfrm>
+                    <a:prstGeom prst="rect">
+                      <a:avLst/>
+                    </a:prstGeom>
+                    <a:noFill/>
+                  </pic:spPr>
+                </pic:pic>
+              </a:graphicData>
+            </a:graphic>
+          </wp:anchor>
+        </w:drawing>
+      </w:r>
+    </w:p>
+    <w:p>
+      <w:pPr>
+        <w:pStyle w:val="Normal"/>
+        <w:spacing w:before="0" w:after="0"/>
+        <w:rPr>
+          <w:color w:val="FF0000"/>
+        </w:rPr>
+      </w:pPr>
+      <w:r>
+        <w:rPr>
+          <w:color w:val="FF0000"/>
+        </w:rPr>
+      </w:r>
+    </w:p>
+    <w:p>
+      <w:pPr>
+        <w:pStyle w:val="Heading3"/>
+        <w:numPr>
+          <w:ilvl w:val="2"/>
+          <w:numId w:val="11"/>
+        </w:numPr>
+        <w:rPr/>
+      </w:pPr>
+      <w:r>
+        <w:rPr/>
         <w:t>Nicht monetäre Vorteile</w:t>
       </w:r>
     </w:p>
@@ -7611,8 +7685,8 @@
         <w:rPr/>
       </w:pPr>
       <w:bookmarkStart w:id="45" w:name="_Toc218703506"/>
-      <w:bookmarkStart w:id="46" w:name="_Toc181697565"/>
-      <w:bookmarkStart w:id="47" w:name="_Toc181709013"/>
+      <w:bookmarkStart w:id="46" w:name="_Toc181709013"/>
+      <w:bookmarkStart w:id="47" w:name="_Toc181697565"/>
       <w:r>
         <w:rPr/>
         <w:t>Projektablauf</w:t>
@@ -7731,8 +7805,8 @@
         </w:numPr>
         <w:rPr/>
       </w:pPr>
-      <w:bookmarkStart w:id="51" w:name="_Toc218703508"/>
-      <w:bookmarkStart w:id="52" w:name="_Toc181709017"/>
+      <w:bookmarkStart w:id="51" w:name="_Toc181709017"/>
+      <w:bookmarkStart w:id="52" w:name="_Toc218703508"/>
       <w:r>
         <w:rPr/>
         <w:t>A</w:t>
@@ -7982,36 +8056,6 @@
     </w:p>
     <w:p>
       <w:pPr>
-        <w:pStyle w:val="Normal"/>
-        <w:rPr>
-          <w:color w:val="000000"/>
-          <w:lang w:eastAsia="de-DE"/>
-        </w:rPr>
-      </w:pPr>
-      <w:r>
-        <w:rPr>
-          <w:color w:val="000000"/>
-          <w:lang w:eastAsia="de-DE"/>
-        </w:rPr>
-      </w:r>
-    </w:p>
-    <w:p>
-      <w:pPr>
-        <w:pStyle w:val="Normal"/>
-        <w:rPr>
-          <w:color w:val="000000"/>
-          <w:lang w:eastAsia="de-DE"/>
-        </w:rPr>
-      </w:pPr>
-      <w:r>
-        <w:rPr>
-          <w:color w:val="000000"/>
-          <w:lang w:eastAsia="de-DE"/>
-        </w:rPr>
-      </w:r>
-    </w:p>
-    <w:p>
-      <w:pPr>
         <w:pStyle w:val="Heading2"/>
         <w:numPr>
           <w:ilvl w:val="1"/>
@@ -8776,9 +8820,9 @@
           <w:lang w:eastAsia="de-DE"/>
         </w:rPr>
       </w:pPr>
-      <w:bookmarkStart w:id="56" w:name="_Toc181709019"/>
+      <w:bookmarkStart w:id="56" w:name="_Toc218703512"/>
       <w:bookmarkStart w:id="57" w:name="_Toc181697569"/>
-      <w:bookmarkStart w:id="58" w:name="_Toc218703512"/>
+      <w:bookmarkStart w:id="58" w:name="_Toc181709019"/>
       <w:r>
         <w:rPr>
           <w:lang w:eastAsia="de-DE"/>
@@ -9024,11 +9068,11 @@
         </w:numPr>
         <w:rPr/>
       </w:pPr>
-      <w:bookmarkStart w:id="63" w:name="_Toc181697572"/>
+      <w:bookmarkStart w:id="63" w:name="_Toc218703515"/>
       <w:bookmarkStart w:id="64" w:name="_Toc181709022"/>
-      <w:bookmarkStart w:id="65" w:name="_Toc218703515"/>
-      <w:bookmarkStart w:id="66" w:name="_Toc182399913"/>
-      <w:bookmarkStart w:id="67" w:name="_Toc182313734"/>
+      <w:bookmarkStart w:id="65" w:name="_Toc181697572"/>
+      <w:bookmarkStart w:id="66" w:name="_Toc182313734"/>
+      <w:bookmarkStart w:id="67" w:name="_Toc182399913"/>
       <w:bookmarkEnd w:id="66"/>
       <w:bookmarkEnd w:id="67"/>
       <w:r>
@@ -9062,8 +9106,8 @@
         </w:numPr>
         <w:rPr/>
       </w:pPr>
-      <w:bookmarkStart w:id="68" w:name="_Toc181709023"/>
-      <w:bookmarkStart w:id="69" w:name="_Toc218703516"/>
+      <w:bookmarkStart w:id="68" w:name="_Toc218703516"/>
+      <w:bookmarkStart w:id="69" w:name="_Toc181709023"/>
       <w:r>
         <w:rPr/>
         <w:t>Übergabe</w:t>
@@ -9174,9 +9218,9 @@
         </w:numPr>
         <w:rPr/>
       </w:pPr>
-      <w:bookmarkStart w:id="73" w:name="_Toc218703519"/>
+      <w:bookmarkStart w:id="73" w:name="_Toc181697574"/>
       <w:bookmarkStart w:id="74" w:name="_Toc181709025"/>
-      <w:bookmarkStart w:id="75" w:name="_Toc181697574"/>
+      <w:bookmarkStart w:id="75" w:name="_Toc218703519"/>
       <w:r>
         <w:rPr/>
         <w:t>Quellen</w:t>
@@ -9198,7 +9242,7 @@
           <w:lang w:eastAsia="de-DE"/>
         </w:rPr>
       </w:pPr>
-      <w:hyperlink r:id="rId16">
+      <w:hyperlink r:id="rId19">
         <w:r>
           <w:rPr>
             <w:rStyle w:val="Hyperlink"/>
@@ -9218,15 +9262,15 @@
         </w:numPr>
         <w:rPr/>
       </w:pPr>
-      <w:bookmarkStart w:id="76" w:name="_Toc181697575"/>
+      <w:bookmarkStart w:id="76" w:name="_Toc218703520"/>
       <w:bookmarkStart w:id="77" w:name="_Toc181709026"/>
-      <w:bookmarkStart w:id="78" w:name="_Toc218703520"/>
+      <w:bookmarkStart w:id="78" w:name="_Toc181697575"/>
       <w:r>
         <w:rPr/>
         <w:t>Abbildungsverzeichnis</w:t>
       </w:r>
-      <w:bookmarkStart w:id="79" w:name="_Toc181697576"/>
-      <w:bookmarkStart w:id="80" w:name="_Toc181709027"/>
+      <w:bookmarkStart w:id="79" w:name="_Toc181709027"/>
+      <w:bookmarkStart w:id="80" w:name="_Toc181697576"/>
       <w:bookmarkEnd w:id="76"/>
       <w:bookmarkEnd w:id="77"/>
       <w:bookmarkEnd w:id="78"/>
@@ -9526,12 +9570,12 @@
           <w:szCs w:val="16"/>
         </w:rPr>
         <w:sectPr>
-          <w:headerReference w:type="even" r:id="rId17"/>
-          <w:headerReference w:type="default" r:id="rId18"/>
-          <w:headerReference w:type="first" r:id="rId19"/>
-          <w:footerReference w:type="even" r:id="rId20"/>
-          <w:footerReference w:type="default" r:id="rId21"/>
-          <w:footerReference w:type="first" r:id="rId22"/>
+          <w:headerReference w:type="even" r:id="rId20"/>
+          <w:headerReference w:type="default" r:id="rId21"/>
+          <w:headerReference w:type="first" r:id="rId22"/>
+          <w:footerReference w:type="even" r:id="rId23"/>
+          <w:footerReference w:type="default" r:id="rId24"/>
+          <w:footerReference w:type="first" r:id="rId25"/>
           <w:type w:val="nextPage"/>
           <w:pgSz w:w="11906" w:h="16838"/>
           <w:pgMar w:left="1701" w:right="1134" w:gutter="0" w:header="426" w:top="1702" w:footer="791" w:bottom="1134"/>
@@ -9863,12 +9907,12 @@
       </w:r>
     </w:p>
     <w:sectPr>
-      <w:headerReference w:type="even" r:id="rId23"/>
-      <w:headerReference w:type="default" r:id="rId24"/>
-      <w:headerReference w:type="first" r:id="rId25"/>
-      <w:footerReference w:type="even" r:id="rId26"/>
-      <w:footerReference w:type="default" r:id="rId27"/>
-      <w:footerReference w:type="first" r:id="rId28"/>
+      <w:headerReference w:type="even" r:id="rId26"/>
+      <w:headerReference w:type="default" r:id="rId27"/>
+      <w:headerReference w:type="first" r:id="rId28"/>
+      <w:footerReference w:type="even" r:id="rId29"/>
+      <w:footerReference w:type="default" r:id="rId30"/>
+      <w:footerReference w:type="first" r:id="rId31"/>
       <w:type w:val="nextPage"/>
       <w:pgSz w:w="11906" w:h="16838"/>
       <w:pgMar w:left="1701" w:right="1134" w:gutter="0" w:header="426" w:top="1702" w:footer="791" w:bottom="1134"/>
@@ -9887,7 +9931,7 @@
   <w:comment w:id="0" w:author="Pia Wittenbecher" w:date="2026-01-07T17:35:00Z" w:initials="PW">
     <w:p>
       <w:pPr>
-        <w:overflowPunct w:val="true"/>
+        <w:overflowPunct w:val="false"/>
         <w:spacing w:lineRule="auto" w:line="240" w:before="0" w:after="0"/>
         <w:jc w:val="start"/>
         <w:rPr/>
@@ -9906,7 +9950,7 @@
     </w:p>
     <w:p>
       <w:pPr>
-        <w:overflowPunct w:val="true"/>
+        <w:overflowPunct w:val="false"/>
         <w:spacing w:lineRule="auto" w:line="240" w:before="0" w:after="0"/>
         <w:jc w:val="start"/>
         <w:rPr/>
@@ -9920,7 +9964,7 @@
     </w:p>
     <w:p>
       <w:pPr>
-        <w:overflowPunct w:val="true"/>
+        <w:overflowPunct w:val="false"/>
         <w:spacing w:lineRule="auto" w:line="240" w:before="0" w:after="0"/>
         <w:jc w:val="start"/>
         <w:rPr/>
@@ -9934,7 +9978,7 @@
     </w:p>
     <w:p>
       <w:pPr>
-        <w:overflowPunct w:val="true"/>
+        <w:overflowPunct w:val="false"/>
         <w:spacing w:lineRule="auto" w:line="240" w:before="0" w:after="0"/>
         <w:jc w:val="start"/>
         <w:rPr/>
@@ -9948,7 +9992,7 @@
     </w:p>
     <w:p>
       <w:pPr>
-        <w:overflowPunct w:val="true"/>
+        <w:overflowPunct w:val="false"/>
         <w:spacing w:lineRule="auto" w:line="240" w:before="0" w:after="0"/>
         <w:jc w:val="start"/>
         <w:rPr/>
@@ -9961,7 +10005,7 @@
     </w:p>
     <w:p>
       <w:pPr>
-        <w:overflowPunct w:val="true"/>
+        <w:overflowPunct w:val="false"/>
         <w:spacing w:lineRule="auto" w:line="240" w:before="0" w:after="0"/>
         <w:jc w:val="start"/>
         <w:rPr/>
@@ -9977,7 +10021,7 @@
     </w:p>
     <w:p>
       <w:pPr>
-        <w:overflowPunct w:val="true"/>
+        <w:overflowPunct w:val="false"/>
         <w:spacing w:lineRule="auto" w:line="240" w:before="0" w:after="0"/>
         <w:jc w:val="start"/>
         <w:rPr/>
@@ -9991,7 +10035,7 @@
     </w:p>
     <w:p>
       <w:pPr>
-        <w:overflowPunct w:val="true"/>
+        <w:overflowPunct w:val="false"/>
         <w:spacing w:lineRule="auto" w:line="240" w:before="0" w:after="0"/>
         <w:jc w:val="start"/>
         <w:rPr/>
@@ -10007,7 +10051,7 @@
   <w:comment w:id="1" w:author="Pia Wittenbecher" w:date="2026-01-07T17:39:00Z" w:initials="PW">
     <w:p>
       <w:pPr>
-        <w:overflowPunct w:val="true"/>
+        <w:overflowPunct w:val="false"/>
         <w:spacing w:lineRule="auto" w:line="240" w:before="0" w:after="0"/>
         <w:jc w:val="start"/>
         <w:rPr/>
@@ -10026,7 +10070,7 @@
     </w:p>
     <w:p>
       <w:pPr>
-        <w:overflowPunct w:val="true"/>
+        <w:overflowPunct w:val="false"/>
         <w:spacing w:lineRule="auto" w:line="240" w:before="0" w:after="0"/>
         <w:jc w:val="start"/>
         <w:rPr/>
@@ -10040,7 +10084,7 @@
     </w:p>
     <w:p>
       <w:pPr>
-        <w:overflowPunct w:val="true"/>
+        <w:overflowPunct w:val="false"/>
         <w:spacing w:lineRule="auto" w:line="240" w:before="0" w:after="0"/>
         <w:jc w:val="start"/>
         <w:rPr/>
@@ -10625,9 +10669,9 @@
                         <a:avLst/>
                         <a:gdLst>
                           <a:gd name="textAreaLeft" fmla="*/ 0 w 540000"/>
-                          <a:gd name="textAreaRight" fmla="*/ 542160 w 540000"/>
+                          <a:gd name="textAreaRight" fmla="*/ 543960 w 540000"/>
                           <a:gd name="textAreaTop" fmla="*/ 0 h 191160"/>
-                          <a:gd name="textAreaBottom" fmla="*/ 193320 h 191160"/>
+                          <a:gd name="textAreaBottom" fmla="*/ 195120 h 191160"/>
                         </a:gdLst>
                         <a:ahLst/>
                         <a:cxnLst/>
@@ -10766,7 +10810,7 @@
             <wp:inline distT="0" distB="0" distL="0" distR="0" wp14:anchorId="71BD407D">
               <wp:extent cx="952500" cy="337185"/>
               <wp:effectExtent l="0" t="0" r="635" b="6350"/>
-              <wp:docPr id="6" name="Freeform 1"/>
+              <wp:docPr id="9" name="Freeform 1"/>
               <a:graphic xmlns:a="http://schemas.openxmlformats.org/drawingml/2006/main">
                 <a:graphicData uri="http://schemas.microsoft.com/office/word/2010/wordprocessingShape">
                   <wps:wsp>
@@ -10780,9 +10824,9 @@
                         <a:avLst/>
                         <a:gdLst>
                           <a:gd name="textAreaLeft" fmla="*/ 0 w 540000"/>
-                          <a:gd name="textAreaRight" fmla="*/ 542160 w 540000"/>
+                          <a:gd name="textAreaRight" fmla="*/ 543960 w 540000"/>
                           <a:gd name="textAreaTop" fmla="*/ 0 h 191160"/>
-                          <a:gd name="textAreaBottom" fmla="*/ 193320 h 191160"/>
+                          <a:gd name="textAreaBottom" fmla="*/ 195120 h 191160"/>
                         </a:gdLst>
                         <a:ahLst/>
                         <a:cxnLst/>
@@ -13495,15 +13539,15 @@
       <w:iCs/>
     </w:rPr>
   </w:style>
-  <w:style w:type="character" w:styleId="Bulletsuser">
-    <w:name w:val="Bullets (user)"/>
+  <w:style w:type="character" w:styleId="Bullets">
+    <w:name w:val="Bullets"/>
     <w:qFormat/>
     <w:rPr>
       <w:rFonts w:ascii="OpenSymbol" w:hAnsi="OpenSymbol" w:eastAsia="OpenSymbol" w:cs="OpenSymbol"/>
     </w:rPr>
   </w:style>
-  <w:style w:type="character" w:styleId="Bullets">
-    <w:name w:val="Bullets"/>
+  <w:style w:type="character" w:styleId="Bulletsuser">
+    <w:name w:val="Bullets (user)"/>
     <w:qFormat/>
     <w:rPr>
       <w:rFonts w:ascii="OpenSymbol" w:hAnsi="OpenSymbol" w:eastAsia="OpenSymbol" w:cs="OpenSymbol"/>
@@ -13811,7 +13855,7 @@
     <w:semiHidden/>
     <w:rsid w:val="00875818"/>
     <w:pPr>
-      <w:overflowPunct w:val="false"/>
+      <w:overflowPunct w:val="true"/>
       <w:spacing w:lineRule="auto" w:line="312" w:before="120" w:after="0"/>
       <w:textAlignment w:val="baseline"/>
     </w:pPr>
@@ -14179,6 +14223,20 @@
       <w:lang w:eastAsia="en-US"/>
     </w:rPr>
   </w:style>
+  <w:style w:type="paragraph" w:styleId="FrameContents">
+    <w:name w:val="Frame Contents"/>
+    <w:basedOn w:val="Normal"/>
+    <w:qFormat/>
+    <w:pPr/>
+    <w:rPr/>
+  </w:style>
+  <w:style w:type="paragraph" w:styleId="HeaderLeft">
+    <w:name w:val="Header Left"/>
+    <w:basedOn w:val="Header"/>
+    <w:qFormat/>
+    <w:pPr/>
+    <w:rPr/>
+  </w:style>
   <w:style w:type="paragraph" w:styleId="FrameContentsuser">
     <w:name w:val="Frame Contents (user)"/>
     <w:basedOn w:val="Normal"/>
@@ -14186,22 +14244,8 @@
     <w:pPr/>
     <w:rPr/>
   </w:style>
-  <w:style w:type="paragraph" w:styleId="HeaderLeftuser">
-    <w:name w:val="Header Left (user)"/>
-    <w:basedOn w:val="Header"/>
-    <w:qFormat/>
-    <w:pPr/>
-    <w:rPr/>
-  </w:style>
-  <w:style w:type="paragraph" w:styleId="FrameContents">
-    <w:name w:val="Frame Contents"/>
-    <w:basedOn w:val="Normal"/>
-    <w:qFormat/>
-    <w:pPr/>
-    <w:rPr/>
-  </w:style>
-  <w:style w:type="paragraph" w:styleId="BlockQuotation">
-    <w:name w:val="Block Quotation"/>
+  <w:style w:type="paragraph" w:styleId="BlockQuotationuser">
+    <w:name w:val="Block Quotation (user)"/>
     <w:basedOn w:val="Normal"/>
     <w:qFormat/>
     <w:pPr>

</xml_diff>